<commit_message>
fix(resume): show AZ-104/AZ-400 earned 2025, renewed 2026
</commit_message>
<xml_diff>
--- a/resume/Colin-Shanahan-Resume-Mobile.docx
+++ b/resume/Colin-Shanahan-Resume-Mobile.docx
@@ -515,7 +515,7 @@
           <w:b w:val="0"/>
           <w:sz w:val="23"/>
         </w:rPr>
-        <w:t>Microsoft Azure Administrator (AZ-104, 2026)</w:t>
+        <w:t>Microsoft Azure Administrator (AZ-104, 2025, renewed 2026)</w:t>
       </w:r>
     </w:p>
     <w:p>
@@ -529,7 +529,7 @@
           <w:b w:val="0"/>
           <w:sz w:val="23"/>
         </w:rPr>
-        <w:t>Microsoft DevOps Engineer Expert (AZ-400, 2026)</w:t>
+        <w:t>Microsoft DevOps Engineer Expert (AZ-400, 2025, renewed 2026)</w:t>
       </w:r>
     </w:p>
     <w:p>

</xml_diff>

<commit_message>
fix(resume): show AZ-104/AZ-400 earned 2025, renewed 2026 (#73)
Replaces the mobile resume PDF/DOCX with Work Finder's corrected
version: AZ-104 and AZ-400 now read '2025, renewed 2026'. Standard
resume unchanged. Do not merge without Colin's OK.
</commit_message>
<xml_diff>
--- a/resume/Colin-Shanahan-Resume-Mobile.docx
+++ b/resume/Colin-Shanahan-Resume-Mobile.docx
@@ -515,7 +515,7 @@
           <w:b w:val="0"/>
           <w:sz w:val="23"/>
         </w:rPr>
-        <w:t>Microsoft Azure Administrator (AZ-104, 2026)</w:t>
+        <w:t>Microsoft Azure Administrator (AZ-104, 2025, renewed 2026)</w:t>
       </w:r>
     </w:p>
     <w:p>
@@ -529,7 +529,7 @@
           <w:b w:val="0"/>
           <w:sz w:val="23"/>
         </w:rPr>
-        <w:t>Microsoft DevOps Engineer Expert (AZ-400, 2026)</w:t>
+        <w:t>Microsoft DevOps Engineer Expert (AZ-400, 2025, renewed 2026)</w:t>
       </w:r>
     </w:p>
     <w:p>

</xml_diff>